<commit_message>
Fix: memperbaiki template export PKA
</commit_message>
<xml_diff>
--- a/Template Program Kerja Audit.docx
+++ b/Template Program Kerja Audit.docx
@@ -9688,8 +9688,8 @@
       </w:tblPr>
       <w:tblGrid>
         <w:gridCol w:w="2552"/>
-        <w:gridCol w:w="4536"/>
-        <w:gridCol w:w="1843"/>
+        <w:gridCol w:w="4111"/>
+        <w:gridCol w:w="2268"/>
       </w:tblGrid>
       <w:tr>
         <w:trPr>
@@ -9724,7 +9724,7 @@
         </w:tc>
         <w:tc>
           <w:tcPr>
-            <w:tcW w:w="4536" w:type="dxa"/>
+            <w:tcW w:w="4111" w:type="dxa"/>
             <w:shd w:val="clear" w:color="auto" w:fill="D9D9D9"/>
             <w:vAlign w:val="center"/>
           </w:tcPr>
@@ -9752,7 +9752,7 @@
         </w:tc>
         <w:tc>
           <w:tcPr>
-            <w:tcW w:w="1843" w:type="dxa"/>
+            <w:tcW w:w="2268" w:type="dxa"/>
             <w:shd w:val="clear" w:color="auto" w:fill="D9D9D9"/>
             <w:vAlign w:val="center"/>
           </w:tcPr>
@@ -9806,7 +9806,7 @@
         </w:tc>
         <w:tc>
           <w:tcPr>
-            <w:tcW w:w="4536" w:type="dxa"/>
+            <w:tcW w:w="4111" w:type="dxa"/>
           </w:tcPr>
           <w:p>
             <w:pPr>
@@ -10194,7 +10194,17 @@
                 <w:szCs w:val="20"/>
                 <w:lang w:val="id-ID"/>
               </w:rPr>
-              <w:t>Melakukan pengujian desain kontrol (ToD):</w:t>
+              <w:t xml:space="preserve">Melakukan pengujian desain kontrol </w:t>
+            </w:r>
+            <w:r>
+              <w:rPr>
+                <w:rFonts w:ascii="Tahoma" w:hAnsi="Tahoma" w:cs="Tahoma"/>
+                <w:sz w:val="20"/>
+                <w:szCs w:val="20"/>
+                <w:lang w:val="id-ID"/>
+              </w:rPr>
+              <w:lastRenderedPageBreak/>
+              <w:t>(ToD):</w:t>
             </w:r>
           </w:p>
           <w:p>
@@ -10220,7 +10230,6 @@
                 <w:szCs w:val="20"/>
                 <w:lang w:val="id-ID"/>
               </w:rPr>
-              <w:lastRenderedPageBreak/>
               <w:t>Mendapatkan dokumen kontrol</w:t>
             </w:r>
           </w:p>
@@ -10454,11 +10463,12 @@
         </w:tc>
         <w:tc>
           <w:tcPr>
-            <w:tcW w:w="1843" w:type="dxa"/>
+            <w:tcW w:w="2268" w:type="dxa"/>
           </w:tcPr>
           <w:p>
             <w:pPr>
               <w:spacing w:line="240" w:lineRule="auto"/>
+              <w:jc w:val="left"/>
               <w:rPr>
                 <w:rFonts w:ascii="Tahoma" w:hAnsi="Tahoma" w:cs="Tahoma"/>
               </w:rPr>
@@ -11320,7 +11330,7 @@
         </mc:Choice>
         <mc:Fallback>
           <w:pict>
-            <v:line w14:anchorId="69009379" id="Straight Connector 1" o:spid="_x0000_s1026" style="position:absolute;z-index:251658243;visibility:visible;mso-wrap-style:square;mso-width-percent:0;mso-height-percent:0;mso-wrap-distance-left:9pt;mso-wrap-distance-top:-8e-5mm;mso-wrap-distance-right:9pt;mso-wrap-distance-bottom:-8e-5mm;mso-position-horizontal:absolute;mso-position-horizontal-relative:text;mso-position-vertical:absolute;mso-position-vertical-relative:text;mso-width-percent:0;mso-height-percent:0;mso-width-relative:page;mso-height-relative:page" from="-.05pt,.1pt" to="485.95pt,.1pt" o:gfxdata="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">
+            <v:line w14:anchorId="50D17CB5" id="Straight Connector 1" o:spid="_x0000_s1026" style="position:absolute;z-index:251658243;visibility:visible;mso-wrap-style:square;mso-width-percent:0;mso-height-percent:0;mso-wrap-distance-left:9pt;mso-wrap-distance-top:-8e-5mm;mso-wrap-distance-right:9pt;mso-wrap-distance-bottom:-8e-5mm;mso-position-horizontal:absolute;mso-position-horizontal-relative:text;mso-position-vertical:absolute;mso-position-vertical-relative:text;mso-width-percent:0;mso-height-percent:0;mso-width-relative:page;mso-height-relative:page" from="-.05pt,.1pt" to="485.95pt,.1pt" o:gfxdata="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">
               <o:lock v:ext="edit" shapetype="f"/>
             </v:line>
           </w:pict>
@@ -11495,7 +11505,7 @@
         </mc:Choice>
         <mc:Fallback>
           <w:pict>
-            <v:line w14:anchorId="3EDE4E74" id="Straight Connector 1159367546" o:spid="_x0000_s1026" style="position:absolute;z-index:251658246;visibility:visible;mso-wrap-style:square;mso-width-percent:0;mso-height-percent:0;mso-wrap-distance-left:9pt;mso-wrap-distance-top:-8e-5mm;mso-wrap-distance-right:9pt;mso-wrap-distance-bottom:-8e-5mm;mso-position-horizontal:absolute;mso-position-horizontal-relative:text;mso-position-vertical:absolute;mso-position-vertical-relative:text;mso-width-percent:0;mso-height-percent:0;mso-width-relative:page;mso-height-relative:page" from=".25pt,3.8pt" to="816.6pt,6.55pt" o:gfxdata="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" o:allowincell="f">
+            <v:line w14:anchorId="4895A3FC" id="Straight Connector 1159367546" o:spid="_x0000_s1026" style="position:absolute;z-index:251658246;visibility:visible;mso-wrap-style:square;mso-width-percent:0;mso-height-percent:0;mso-wrap-distance-left:9pt;mso-wrap-distance-top:-8e-5mm;mso-wrap-distance-right:9pt;mso-wrap-distance-bottom:-8e-5mm;mso-position-horizontal:absolute;mso-position-horizontal-relative:text;mso-position-vertical:absolute;mso-position-vertical-relative:text;mso-width-percent:0;mso-height-percent:0;mso-width-relative:page;mso-height-relative:page" from=".25pt,3.8pt" to="816.6pt,6.55pt" o:gfxdata="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" o:allowincell="f">
               <o:lock v:ext="edit" shapetype="f"/>
             </v:line>
           </w:pict>
@@ -11670,7 +11680,7 @@
         </mc:Choice>
         <mc:Fallback>
           <w:pict>
-            <v:line w14:anchorId="0821DF0A" id="Straight Connector 408406482" o:spid="_x0000_s1026" style="position:absolute;z-index:251658241;visibility:visible;mso-wrap-style:square;mso-width-percent:0;mso-height-percent:0;mso-wrap-distance-left:9pt;mso-wrap-distance-top:-8e-5mm;mso-wrap-distance-right:9pt;mso-wrap-distance-bottom:-8e-5mm;mso-position-horizontal:absolute;mso-position-horizontal-relative:text;mso-position-vertical:absolute;mso-position-vertical-relative:text;mso-width-percent:0;mso-height-percent:0;mso-width-relative:page;mso-height-relative:page" from=".1pt,3.75pt" to="465.9pt,3.75pt" o:gfxdata="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" o:allowincell="f">
+            <v:line w14:anchorId="03ABCBF9" id="Straight Connector 408406482" o:spid="_x0000_s1026" style="position:absolute;z-index:251658241;visibility:visible;mso-wrap-style:square;mso-width-percent:0;mso-height-percent:0;mso-wrap-distance-left:9pt;mso-wrap-distance-top:-8e-5mm;mso-wrap-distance-right:9pt;mso-wrap-distance-bottom:-8e-5mm;mso-position-horizontal:absolute;mso-position-horizontal-relative:text;mso-position-vertical:absolute;mso-position-vertical-relative:text;mso-width-percent:0;mso-height-percent:0;mso-width-relative:page;mso-height-relative:page" from=".1pt,3.75pt" to="465.9pt,3.75pt" o:gfxdata="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" o:allowincell="f">
               <o:lock v:ext="edit" shapetype="f"/>
             </v:line>
           </w:pict>
@@ -11994,7 +12004,7 @@
         </mc:Choice>
         <mc:Fallback>
           <w:pict>
-            <v:line w14:anchorId="0379BF6E" id="Straight Connector 3" o:spid="_x0000_s1026" style="position:absolute;z-index:251658240;visibility:visible;mso-wrap-style:square;mso-width-percent:0;mso-height-percent:0;mso-wrap-distance-left:9pt;mso-wrap-distance-top:-8e-5mm;mso-wrap-distance-right:9pt;mso-wrap-distance-bottom:-8e-5mm;mso-position-horizontal:absolute;mso-position-horizontal-relative:text;mso-position-vertical:absolute;mso-position-vertical-relative:text;mso-width-percent:0;mso-height-percent:0;mso-width-relative:page;mso-height-relative:page" from="2.15pt,5.1pt" to="818.5pt,7.85pt" o:gfxdata="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" o:allowincell="f">
+            <v:line w14:anchorId="757401F0" id="Straight Connector 3" o:spid="_x0000_s1026" style="position:absolute;z-index:251658240;visibility:visible;mso-wrap-style:square;mso-width-percent:0;mso-height-percent:0;mso-wrap-distance-left:9pt;mso-wrap-distance-top:-8e-5mm;mso-wrap-distance-right:9pt;mso-wrap-distance-bottom:-8e-5mm;mso-position-horizontal:absolute;mso-position-horizontal-relative:text;mso-position-vertical:absolute;mso-position-vertical-relative:text;mso-width-percent:0;mso-height-percent:0;mso-width-relative:page;mso-height-relative:page" from="2.15pt,5.1pt" to="818.5pt,7.85pt" o:gfxdata="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" o:allowincell="f">
               <o:lock v:ext="edit" shapetype="f"/>
             </v:line>
           </w:pict>
@@ -12206,7 +12216,7 @@
         </mc:Choice>
         <mc:Fallback>
           <w:pict>
-            <v:line w14:anchorId="70B1356A" id="Straight Connector 992184601" o:spid="_x0000_s1026" style="position:absolute;z-index:251658242;visibility:visible;mso-wrap-style:square;mso-width-percent:0;mso-height-percent:0;mso-wrap-distance-left:9pt;mso-wrap-distance-top:-8e-5mm;mso-wrap-distance-right:9pt;mso-wrap-distance-bottom:-8e-5mm;mso-position-horizontal:absolute;mso-position-horizontal-relative:text;mso-position-vertical:absolute;mso-position-vertical-relative:text;mso-width-percent:0;mso-height-percent:0;mso-width-relative:page;mso-height-relative:page" from="4.75pt,5.4pt" to="444.6pt,5.4pt" o:gfxdata="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" o:allowincell="f">
+            <v:line w14:anchorId="2BC3683B" id="Straight Connector 992184601" o:spid="_x0000_s1026" style="position:absolute;z-index:251658242;visibility:visible;mso-wrap-style:square;mso-width-percent:0;mso-height-percent:0;mso-wrap-distance-left:9pt;mso-wrap-distance-top:-8e-5mm;mso-wrap-distance-right:9pt;mso-wrap-distance-bottom:-8e-5mm;mso-position-horizontal:absolute;mso-position-horizontal-relative:text;mso-position-vertical:absolute;mso-position-vertical-relative:text;mso-width-percent:0;mso-height-percent:0;mso-width-relative:page;mso-height-relative:page" from="4.75pt,5.4pt" to="444.6pt,5.4pt" o:gfxdata="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" o:allowincell="f">
               <o:lock v:ext="edit" shapetype="f"/>
             </v:line>
           </w:pict>
@@ -15504,6 +15514,7 @@
   <w:style w:type="character" w:default="1" w:styleId="DefaultParagraphFont">
     <w:name w:val="Default Paragraph Font"/>
     <w:uiPriority w:val="1"/>
+    <w:semiHidden/>
     <w:unhideWhenUsed/>
   </w:style>
   <w:style w:type="table" w:default="1" w:styleId="TableNormal">
@@ -19522,6 +19533,26 @@
 </file>
 
 <file path=customXml/item1.xml><?xml version="1.0" encoding="utf-8"?>
+<p:properties xmlns:p="http://schemas.microsoft.com/office/2006/metadata/properties" xmlns:xsi="http://www.w3.org/2001/XMLSchema-instance" xmlns:pc="http://schemas.microsoft.com/office/infopath/2007/PartnerControls">
+  <documentManagement>
+    <lcf76f155ced4ddcb4097134ff3c332f xmlns="23a56af2-e0ef-4c74-897b-82f4433f7264">
+      <Terms xmlns="http://schemas.microsoft.com/office/infopath/2007/PartnerControls"/>
+    </lcf76f155ced4ddcb4097134ff3c332f>
+    <TaxCatchAll xmlns="732f019d-44d9-4350-92f0-b5a245b5ee72" xsi:nil="true"/>
+  </documentManagement>
+</p:properties>
+</file>
+
+<file path=customXml/item2.xml><?xml version="1.0" encoding="utf-8"?>
+<?mso-contentType ?>
+<FormTemplates xmlns="http://schemas.microsoft.com/sharepoint/v3/contenttype/forms">
+  <Display>DocumentLibraryForm</Display>
+  <Edit>DocumentLibraryForm</Edit>
+  <New>DocumentLibraryForm</New>
+</FormTemplates>
+</file>
+
+<file path=customXml/item3.xml><?xml version="1.0" encoding="utf-8"?>
 <ct:contentTypeSchema xmlns:ct="http://schemas.microsoft.com/office/2006/metadata/contentType" xmlns:ma="http://schemas.microsoft.com/office/2006/metadata/properties/metaAttributes" ct:_="" ma:_="" ma:contentTypeName="Document" ma:contentTypeID="0x0101004C23B53344DF4E4FA81789992A559BB4" ma:contentTypeVersion="11" ma:contentTypeDescription="Create a new document." ma:contentTypeScope="" ma:versionID="8b676a0b7bd70bb2c66c73fe345068e7">
   <xsd:schema xmlns:xsd="http://www.w3.org/2001/XMLSchema" xmlns:xs="http://www.w3.org/2001/XMLSchema" xmlns:p="http://schemas.microsoft.com/office/2006/metadata/properties" xmlns:ns2="23a56af2-e0ef-4c74-897b-82f4433f7264" xmlns:ns3="732f019d-44d9-4350-92f0-b5a245b5ee72" targetNamespace="http://schemas.microsoft.com/office/2006/metadata/properties" ma:root="true" ma:fieldsID="8af524e5481aab5be5d4f4383df9c79d" ns2:_="" ns3:_="">
     <xsd:import namespace="23a56af2-e0ef-4c74-897b-82f4433f7264"/>
@@ -19716,31 +19747,30 @@
 </ct:contentTypeSchema>
 </file>
 
-<file path=customXml/item2.xml><?xml version="1.0" encoding="utf-8"?>
-<?mso-contentType ?>
-<FormTemplates xmlns="http://schemas.microsoft.com/sharepoint/v3/contenttype/forms">
-  <Display>DocumentLibraryForm</Display>
-  <Edit>DocumentLibraryForm</Edit>
-  <New>DocumentLibraryForm</New>
-</FormTemplates>
-</file>
-
-<file path=customXml/item3.xml><?xml version="1.0" encoding="utf-8"?>
-<p:properties xmlns:p="http://schemas.microsoft.com/office/2006/metadata/properties" xmlns:xsi="http://www.w3.org/2001/XMLSchema-instance" xmlns:pc="http://schemas.microsoft.com/office/infopath/2007/PartnerControls">
-  <documentManagement>
-    <lcf76f155ced4ddcb4097134ff3c332f xmlns="23a56af2-e0ef-4c74-897b-82f4433f7264">
-      <Terms xmlns="http://schemas.microsoft.com/office/infopath/2007/PartnerControls"/>
-    </lcf76f155ced4ddcb4097134ff3c332f>
-    <TaxCatchAll xmlns="732f019d-44d9-4350-92f0-b5a245b5ee72" xsi:nil="true"/>
-  </documentManagement>
-</p:properties>
-</file>
-
 <file path=customXml/item4.xml><?xml version="1.0" encoding="utf-8"?>
 <b:Sources xmlns:b="http://schemas.openxmlformats.org/officeDocument/2006/bibliography" xmlns="http://schemas.openxmlformats.org/officeDocument/2006/bibliography" SelectedStyle="\APA.XSL" StyleName="APA"/>
 </file>
 
 <file path=customXml/itemProps1.xml><?xml version="1.0" encoding="utf-8"?>
+<ds:datastoreItem xmlns:ds="http://schemas.openxmlformats.org/officeDocument/2006/customXml" ds:itemID="{A8F71099-3DE3-4EA2-921C-C6E52A7B2A4F}">
+  <ds:schemaRefs>
+    <ds:schemaRef ds:uri="http://schemas.microsoft.com/office/2006/metadata/properties"/>
+    <ds:schemaRef ds:uri="http://schemas.microsoft.com/office/infopath/2007/PartnerControls"/>
+    <ds:schemaRef ds:uri="23a56af2-e0ef-4c74-897b-82f4433f7264"/>
+    <ds:schemaRef ds:uri="732f019d-44d9-4350-92f0-b5a245b5ee72"/>
+  </ds:schemaRefs>
+</ds:datastoreItem>
+</file>
+
+<file path=customXml/itemProps2.xml><?xml version="1.0" encoding="utf-8"?>
+<ds:datastoreItem xmlns:ds="http://schemas.openxmlformats.org/officeDocument/2006/customXml" ds:itemID="{EE213332-6D22-49EF-AB5F-D31223A8FC0A}">
+  <ds:schemaRefs>
+    <ds:schemaRef ds:uri="http://schemas.microsoft.com/sharepoint/v3/contenttype/forms"/>
+  </ds:schemaRefs>
+</ds:datastoreItem>
+</file>
+
+<file path=customXml/itemProps3.xml><?xml version="1.0" encoding="utf-8"?>
 <ds:datastoreItem xmlns:ds="http://schemas.openxmlformats.org/officeDocument/2006/customXml" ds:itemID="{1E135CD5-C7BF-4C13-BC2A-B32FABF158F1}">
   <ds:schemaRefs>
     <ds:schemaRef ds:uri="http://schemas.microsoft.com/office/2006/metadata/contentType"/>
@@ -19759,25 +19789,6 @@
 </ds:datastoreItem>
 </file>
 
-<file path=customXml/itemProps2.xml><?xml version="1.0" encoding="utf-8"?>
-<ds:datastoreItem xmlns:ds="http://schemas.openxmlformats.org/officeDocument/2006/customXml" ds:itemID="{EE213332-6D22-49EF-AB5F-D31223A8FC0A}">
-  <ds:schemaRefs>
-    <ds:schemaRef ds:uri="http://schemas.microsoft.com/sharepoint/v3/contenttype/forms"/>
-  </ds:schemaRefs>
-</ds:datastoreItem>
-</file>
-
-<file path=customXml/itemProps3.xml><?xml version="1.0" encoding="utf-8"?>
-<ds:datastoreItem xmlns:ds="http://schemas.openxmlformats.org/officeDocument/2006/customXml" ds:itemID="{A8F71099-3DE3-4EA2-921C-C6E52A7B2A4F}">
-  <ds:schemaRefs>
-    <ds:schemaRef ds:uri="http://schemas.microsoft.com/office/2006/metadata/properties"/>
-    <ds:schemaRef ds:uri="http://schemas.microsoft.com/office/infopath/2007/PartnerControls"/>
-    <ds:schemaRef ds:uri="23a56af2-e0ef-4c74-897b-82f4433f7264"/>
-    <ds:schemaRef ds:uri="732f019d-44d9-4350-92f0-b5a245b5ee72"/>
-  </ds:schemaRefs>
-</ds:datastoreItem>
-</file>
-
 <file path=customXml/itemProps4.xml><?xml version="1.0" encoding="utf-8"?>
 <ds:datastoreItem xmlns:ds="http://schemas.openxmlformats.org/officeDocument/2006/customXml" ds:itemID="{4F3AF8FC-B8A4-42C8-A49A-E31CECDE2871}">
   <ds:schemaRefs>

</xml_diff>

<commit_message>
feat(pka): tambah kolom level_risiko pada pka_risiko
- Tambah migration untuk kolom level_risiko di pka_risiko
- Sesuaikan seeder dengan level_risiko
- Tambahkan input select Level Risiko di form Create dan Edit PKA
- Tampilkan Level Risiko sebagai badge di halaman Show PKA
</commit_message>
<xml_diff>
--- a/Template Program Kerja Audit.docx
+++ b/Template Program Kerja Audit.docx
@@ -2858,8 +2858,6 @@
             <w:r>
               <w:rPr>
                 <w:rFonts w:ascii="Tahoma" w:hAnsi="Tahoma" w:cs="Tahoma"/>
-                <w:sz w:val="24"/>
-                <w:szCs w:val="24"/>
                 <w:lang w:val="en-US"/>
               </w:rPr>
               <w:t>${DESKRIPSI_RISIKO}</w:t>
@@ -11330,7 +11328,7 @@
         </mc:Choice>
         <mc:Fallback>
           <w:pict>
-            <v:line w14:anchorId="50D17CB5" id="Straight Connector 1" o:spid="_x0000_s1026" style="position:absolute;z-index:251658243;visibility:visible;mso-wrap-style:square;mso-width-percent:0;mso-height-percent:0;mso-wrap-distance-left:9pt;mso-wrap-distance-top:-8e-5mm;mso-wrap-distance-right:9pt;mso-wrap-distance-bottom:-8e-5mm;mso-position-horizontal:absolute;mso-position-horizontal-relative:text;mso-position-vertical:absolute;mso-position-vertical-relative:text;mso-width-percent:0;mso-height-percent:0;mso-width-relative:page;mso-height-relative:page" from="-.05pt,.1pt" to="485.95pt,.1pt" o:gfxdata="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">
+            <v:line w14:anchorId="71A0F34A" id="Straight Connector 1" o:spid="_x0000_s1026" style="position:absolute;z-index:251658243;visibility:visible;mso-wrap-style:square;mso-width-percent:0;mso-height-percent:0;mso-wrap-distance-left:9pt;mso-wrap-distance-top:-8e-5mm;mso-wrap-distance-right:9pt;mso-wrap-distance-bottom:-8e-5mm;mso-position-horizontal:absolute;mso-position-horizontal-relative:text;mso-position-vertical:absolute;mso-position-vertical-relative:text;mso-width-percent:0;mso-height-percent:0;mso-width-relative:page;mso-height-relative:page" from="-.05pt,.1pt" to="485.95pt,.1pt" o:gfxdata="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">
               <o:lock v:ext="edit" shapetype="f"/>
             </v:line>
           </w:pict>
@@ -11505,7 +11503,7 @@
         </mc:Choice>
         <mc:Fallback>
           <w:pict>
-            <v:line w14:anchorId="4895A3FC" id="Straight Connector 1159367546" o:spid="_x0000_s1026" style="position:absolute;z-index:251658246;visibility:visible;mso-wrap-style:square;mso-width-percent:0;mso-height-percent:0;mso-wrap-distance-left:9pt;mso-wrap-distance-top:-8e-5mm;mso-wrap-distance-right:9pt;mso-wrap-distance-bottom:-8e-5mm;mso-position-horizontal:absolute;mso-position-horizontal-relative:text;mso-position-vertical:absolute;mso-position-vertical-relative:text;mso-width-percent:0;mso-height-percent:0;mso-width-relative:page;mso-height-relative:page" from=".25pt,3.8pt" to="816.6pt,6.55pt" o:gfxdata="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" o:allowincell="f">
+            <v:line w14:anchorId="7AC786FC" id="Straight Connector 1159367546" o:spid="_x0000_s1026" style="position:absolute;z-index:251658246;visibility:visible;mso-wrap-style:square;mso-width-percent:0;mso-height-percent:0;mso-wrap-distance-left:9pt;mso-wrap-distance-top:-8e-5mm;mso-wrap-distance-right:9pt;mso-wrap-distance-bottom:-8e-5mm;mso-position-horizontal:absolute;mso-position-horizontal-relative:text;mso-position-vertical:absolute;mso-position-vertical-relative:text;mso-width-percent:0;mso-height-percent:0;mso-width-relative:page;mso-height-relative:page" from=".25pt,3.8pt" to="816.6pt,6.55pt" o:gfxdata="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" o:allowincell="f">
               <o:lock v:ext="edit" shapetype="f"/>
             </v:line>
           </w:pict>
@@ -11680,7 +11678,7 @@
         </mc:Choice>
         <mc:Fallback>
           <w:pict>
-            <v:line w14:anchorId="03ABCBF9" id="Straight Connector 408406482" o:spid="_x0000_s1026" style="position:absolute;z-index:251658241;visibility:visible;mso-wrap-style:square;mso-width-percent:0;mso-height-percent:0;mso-wrap-distance-left:9pt;mso-wrap-distance-top:-8e-5mm;mso-wrap-distance-right:9pt;mso-wrap-distance-bottom:-8e-5mm;mso-position-horizontal:absolute;mso-position-horizontal-relative:text;mso-position-vertical:absolute;mso-position-vertical-relative:text;mso-width-percent:0;mso-height-percent:0;mso-width-relative:page;mso-height-relative:page" from=".1pt,3.75pt" to="465.9pt,3.75pt" o:gfxdata="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" o:allowincell="f">
+            <v:line w14:anchorId="5D940991" id="Straight Connector 408406482" o:spid="_x0000_s1026" style="position:absolute;z-index:251658241;visibility:visible;mso-wrap-style:square;mso-width-percent:0;mso-height-percent:0;mso-wrap-distance-left:9pt;mso-wrap-distance-top:-8e-5mm;mso-wrap-distance-right:9pt;mso-wrap-distance-bottom:-8e-5mm;mso-position-horizontal:absolute;mso-position-horizontal-relative:text;mso-position-vertical:absolute;mso-position-vertical-relative:text;mso-width-percent:0;mso-height-percent:0;mso-width-relative:page;mso-height-relative:page" from=".1pt,3.75pt" to="465.9pt,3.75pt" o:gfxdata="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" o:allowincell="f">
               <o:lock v:ext="edit" shapetype="f"/>
             </v:line>
           </w:pict>
@@ -12004,7 +12002,7 @@
         </mc:Choice>
         <mc:Fallback>
           <w:pict>
-            <v:line w14:anchorId="757401F0" id="Straight Connector 3" o:spid="_x0000_s1026" style="position:absolute;z-index:251658240;visibility:visible;mso-wrap-style:square;mso-width-percent:0;mso-height-percent:0;mso-wrap-distance-left:9pt;mso-wrap-distance-top:-8e-5mm;mso-wrap-distance-right:9pt;mso-wrap-distance-bottom:-8e-5mm;mso-position-horizontal:absolute;mso-position-horizontal-relative:text;mso-position-vertical:absolute;mso-position-vertical-relative:text;mso-width-percent:0;mso-height-percent:0;mso-width-relative:page;mso-height-relative:page" from="2.15pt,5.1pt" to="818.5pt,7.85pt" o:gfxdata="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" o:allowincell="f">
+            <v:line w14:anchorId="2943801A" id="Straight Connector 3" o:spid="_x0000_s1026" style="position:absolute;z-index:251658240;visibility:visible;mso-wrap-style:square;mso-width-percent:0;mso-height-percent:0;mso-wrap-distance-left:9pt;mso-wrap-distance-top:-8e-5mm;mso-wrap-distance-right:9pt;mso-wrap-distance-bottom:-8e-5mm;mso-position-horizontal:absolute;mso-position-horizontal-relative:text;mso-position-vertical:absolute;mso-position-vertical-relative:text;mso-width-percent:0;mso-height-percent:0;mso-width-relative:page;mso-height-relative:page" from="2.15pt,5.1pt" to="818.5pt,7.85pt" o:gfxdata="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" o:allowincell="f">
               <o:lock v:ext="edit" shapetype="f"/>
             </v:line>
           </w:pict>
@@ -12216,7 +12214,7 @@
         </mc:Choice>
         <mc:Fallback>
           <w:pict>
-            <v:line w14:anchorId="2BC3683B" id="Straight Connector 992184601" o:spid="_x0000_s1026" style="position:absolute;z-index:251658242;visibility:visible;mso-wrap-style:square;mso-width-percent:0;mso-height-percent:0;mso-wrap-distance-left:9pt;mso-wrap-distance-top:-8e-5mm;mso-wrap-distance-right:9pt;mso-wrap-distance-bottom:-8e-5mm;mso-position-horizontal:absolute;mso-position-horizontal-relative:text;mso-position-vertical:absolute;mso-position-vertical-relative:text;mso-width-percent:0;mso-height-percent:0;mso-width-relative:page;mso-height-relative:page" from="4.75pt,5.4pt" to="444.6pt,5.4pt" o:gfxdata="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" o:allowincell="f">
+            <v:line w14:anchorId="35C791E0" id="Straight Connector 992184601" o:spid="_x0000_s1026" style="position:absolute;z-index:251658242;visibility:visible;mso-wrap-style:square;mso-width-percent:0;mso-height-percent:0;mso-wrap-distance-left:9pt;mso-wrap-distance-top:-8e-5mm;mso-wrap-distance-right:9pt;mso-wrap-distance-bottom:-8e-5mm;mso-position-horizontal:absolute;mso-position-horizontal-relative:text;mso-position-vertical:absolute;mso-position-vertical-relative:text;mso-width-percent:0;mso-height-percent:0;mso-width-relative:page;mso-height-relative:page" from="4.75pt,5.4pt" to="444.6pt,5.4pt" o:gfxdata="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" o:allowincell="f">
               <o:lock v:ext="edit" shapetype="f"/>
             </v:line>
           </w:pict>
@@ -19533,6 +19531,15 @@
 </file>
 
 <file path=customXml/item1.xml><?xml version="1.0" encoding="utf-8"?>
+<?mso-contentType ?>
+<FormTemplates xmlns="http://schemas.microsoft.com/sharepoint/v3/contenttype/forms">
+  <Display>DocumentLibraryForm</Display>
+  <Edit>DocumentLibraryForm</Edit>
+  <New>DocumentLibraryForm</New>
+</FormTemplates>
+</file>
+
+<file path=customXml/item2.xml><?xml version="1.0" encoding="utf-8"?>
 <p:properties xmlns:p="http://schemas.microsoft.com/office/2006/metadata/properties" xmlns:xsi="http://www.w3.org/2001/XMLSchema-instance" xmlns:pc="http://schemas.microsoft.com/office/infopath/2007/PartnerControls">
   <documentManagement>
     <lcf76f155ced4ddcb4097134ff3c332f xmlns="23a56af2-e0ef-4c74-897b-82f4433f7264">
@@ -19543,16 +19550,11 @@
 </p:properties>
 </file>
 
-<file path=customXml/item2.xml><?xml version="1.0" encoding="utf-8"?>
-<?mso-contentType ?>
-<FormTemplates xmlns="http://schemas.microsoft.com/sharepoint/v3/contenttype/forms">
-  <Display>DocumentLibraryForm</Display>
-  <Edit>DocumentLibraryForm</Edit>
-  <New>DocumentLibraryForm</New>
-</FormTemplates>
+<file path=customXml/item3.xml><?xml version="1.0" encoding="utf-8"?>
+<b:Sources xmlns:b="http://schemas.openxmlformats.org/officeDocument/2006/bibliography" xmlns="http://schemas.openxmlformats.org/officeDocument/2006/bibliography" SelectedStyle="\APA.XSL" StyleName="APA"/>
 </file>
 
-<file path=customXml/item3.xml><?xml version="1.0" encoding="utf-8"?>
+<file path=customXml/item4.xml><?xml version="1.0" encoding="utf-8"?>
 <ct:contentTypeSchema xmlns:ct="http://schemas.microsoft.com/office/2006/metadata/contentType" xmlns:ma="http://schemas.microsoft.com/office/2006/metadata/properties/metaAttributes" ct:_="" ma:_="" ma:contentTypeName="Document" ma:contentTypeID="0x0101004C23B53344DF4E4FA81789992A559BB4" ma:contentTypeVersion="11" ma:contentTypeDescription="Create a new document." ma:contentTypeScope="" ma:versionID="8b676a0b7bd70bb2c66c73fe345068e7">
   <xsd:schema xmlns:xsd="http://www.w3.org/2001/XMLSchema" xmlns:xs="http://www.w3.org/2001/XMLSchema" xmlns:p="http://schemas.microsoft.com/office/2006/metadata/properties" xmlns:ns2="23a56af2-e0ef-4c74-897b-82f4433f7264" xmlns:ns3="732f019d-44d9-4350-92f0-b5a245b5ee72" targetNamespace="http://schemas.microsoft.com/office/2006/metadata/properties" ma:root="true" ma:fieldsID="8af524e5481aab5be5d4f4383df9c79d" ns2:_="" ns3:_="">
     <xsd:import namespace="23a56af2-e0ef-4c74-897b-82f4433f7264"/>
@@ -19747,11 +19749,15 @@
 </ct:contentTypeSchema>
 </file>
 
-<file path=customXml/item4.xml><?xml version="1.0" encoding="utf-8"?>
-<b:Sources xmlns:b="http://schemas.openxmlformats.org/officeDocument/2006/bibliography" xmlns="http://schemas.openxmlformats.org/officeDocument/2006/bibliography" SelectedStyle="\APA.XSL" StyleName="APA"/>
+<file path=customXml/itemProps1.xml><?xml version="1.0" encoding="utf-8"?>
+<ds:datastoreItem xmlns:ds="http://schemas.openxmlformats.org/officeDocument/2006/customXml" ds:itemID="{EE213332-6D22-49EF-AB5F-D31223A8FC0A}">
+  <ds:schemaRefs>
+    <ds:schemaRef ds:uri="http://schemas.microsoft.com/sharepoint/v3/contenttype/forms"/>
+  </ds:schemaRefs>
+</ds:datastoreItem>
 </file>
 
-<file path=customXml/itemProps1.xml><?xml version="1.0" encoding="utf-8"?>
+<file path=customXml/itemProps2.xml><?xml version="1.0" encoding="utf-8"?>
 <ds:datastoreItem xmlns:ds="http://schemas.openxmlformats.org/officeDocument/2006/customXml" ds:itemID="{A8F71099-3DE3-4EA2-921C-C6E52A7B2A4F}">
   <ds:schemaRefs>
     <ds:schemaRef ds:uri="http://schemas.microsoft.com/office/2006/metadata/properties"/>
@@ -19762,15 +19768,15 @@
 </ds:datastoreItem>
 </file>
 
-<file path=customXml/itemProps2.xml><?xml version="1.0" encoding="utf-8"?>
-<ds:datastoreItem xmlns:ds="http://schemas.openxmlformats.org/officeDocument/2006/customXml" ds:itemID="{EE213332-6D22-49EF-AB5F-D31223A8FC0A}">
+<file path=customXml/itemProps3.xml><?xml version="1.0" encoding="utf-8"?>
+<ds:datastoreItem xmlns:ds="http://schemas.openxmlformats.org/officeDocument/2006/customXml" ds:itemID="{4F3AF8FC-B8A4-42C8-A49A-E31CECDE2871}">
   <ds:schemaRefs>
-    <ds:schemaRef ds:uri="http://schemas.microsoft.com/sharepoint/v3/contenttype/forms"/>
+    <ds:schemaRef ds:uri="http://schemas.openxmlformats.org/officeDocument/2006/bibliography"/>
   </ds:schemaRefs>
 </ds:datastoreItem>
 </file>
 
-<file path=customXml/itemProps3.xml><?xml version="1.0" encoding="utf-8"?>
+<file path=customXml/itemProps4.xml><?xml version="1.0" encoding="utf-8"?>
 <ds:datastoreItem xmlns:ds="http://schemas.openxmlformats.org/officeDocument/2006/customXml" ds:itemID="{1E135CD5-C7BF-4C13-BC2A-B32FABF158F1}">
   <ds:schemaRefs>
     <ds:schemaRef ds:uri="http://schemas.microsoft.com/office/2006/metadata/contentType"/>
@@ -19787,12 +19793,4 @@
     <ds:schemaRef ds:uri="http://schemas.microsoft.com/internal/obd"/>
   </ds:schemaRefs>
 </ds:datastoreItem>
-</file>
-
-<file path=customXml/itemProps4.xml><?xml version="1.0" encoding="utf-8"?>
-<ds:datastoreItem xmlns:ds="http://schemas.openxmlformats.org/officeDocument/2006/customXml" ds:itemID="{4F3AF8FC-B8A4-42C8-A49A-E31CECDE2871}">
-  <ds:schemaRefs>
-    <ds:schemaRef ds:uri="http://schemas.openxmlformats.org/officeDocument/2006/bibliography"/>
-  </ds:schemaRefs>
-</ds:datastoreItem>
 </file>
</xml_diff>